<commit_message>
Actualiza expedientes y contratos y agrega cartas Sears
</commit_message>
<xml_diff>
--- a/templates/contrato-empleado-edva.docx
+++ b/templates/contrato-empleado-edva.docx
@@ -1513,7 +1513,7 @@
           <w:sz w:val="18"/>
           <w:szCs w:val="18"/>
         </w:rPr>
-        <w:t>NIOVENA</w:t>
+        <w:t>NOVENA</w:t>
       </w:r>
       <w:r>
         <w:rPr>
@@ -1541,7 +1541,7 @@
           <w:szCs w:val="18"/>
           <w14:ligatures w14:val="none"/>
         </w:rPr>
-        <w:t>mensual</w:t>
+        <w:t>{{SALARY_PERIOD}}</w:t>
       </w:r>
       <w:r>
         <w:rPr>

</xml_diff>